<commit_message>
Add initial scene files for level and dialogue choice bubble; update plot points in Ossory document
- Created InitialSpawn.tscn for level initialization.
- Added DialogueChoiceBubble.tscn for dialogue interactions.
- Revised plot points in Ossory.docx for clarity and detail.
</commit_message>
<xml_diff>
--- a/Ossory.docx
+++ b/Ossory.docx
@@ -903,6 +903,7 @@
         </w:numPr>
       </w:pPr>
       <w:r>
+        <w:lastRenderedPageBreak/>
         <w:t>In the ossory kingdom (located in the otherworld)</w:t>
       </w:r>
     </w:p>
@@ -2948,6 +2949,9 @@
         <w:t xml:space="preserve"> with a </w:t>
       </w:r>
       <w:r>
+        <w:t xml:space="preserve">power from a </w:t>
+      </w:r>
+      <w:r>
         <w:t>grimoire (red book)</w:t>
       </w:r>
     </w:p>
@@ -2972,36 +2976,28 @@
         </w:numPr>
       </w:pPr>
       <w:r>
-        <w:t xml:space="preserve">Find out later he was banished for giving the king the fake </w:t>
+        <w:t xml:space="preserve">Find out later he was banished for </w:t>
+      </w:r>
+      <w:r>
+        <w:t>writing</w:t>
+      </w:r>
+      <w:r>
+        <w:t xml:space="preserve"> </w:t>
       </w:r>
       <w:proofErr w:type="spellStart"/>
       <w:r>
         <w:t>Raudskinna</w:t>
       </w:r>
       <w:proofErr w:type="spellEnd"/>
-    </w:p>
-    <w:p>
-      <w:pPr>
-        <w:pStyle w:val="ListParagraph"/>
-        <w:numPr>
-          <w:ilvl w:val="4"/>
-          <w:numId w:val="1"/>
-        </w:numPr>
-      </w:pPr>
-      <w:r>
-        <w:t>Turns out to be an attempt at a copy of the real red book</w:t>
-      </w:r>
     </w:p>
     <w:p/>
     <w:p/>
     <w:p/>
-    <w:p/>
     <w:p>
       <w:pPr>
         <w:pStyle w:val="Heading3"/>
       </w:pPr>
       <w:r>
-        <w:lastRenderedPageBreak/>
         <w:t>Copilot Synopsis</w:t>
       </w:r>
     </w:p>
@@ -3041,7 +3037,7 @@
           <w:bCs/>
         </w:rPr>
         <w:pict w14:anchorId="6E4585A1">
-          <v:rect id="_x0000_i1171" style="width:0;height:1.5pt" o:hralign="center" o:hrstd="t" o:hr="t" fillcolor="#a0a0a0" stroked="f"/>
+          <v:rect id="_x0000_i1025" style="width:0;height:1.5pt" o:hralign="center" o:hrstd="t" o:hr="t" fillcolor="#a0a0a0" stroked="f"/>
         </w:pict>
       </w:r>
     </w:p>
@@ -3050,6 +3046,7 @@
         <w:pStyle w:val="Heading4"/>
       </w:pPr>
       <w:r>
+        <w:lastRenderedPageBreak/>
         <w:t>ACT I – DENIAL (The World Is Black and White)</w:t>
       </w:r>
     </w:p>
@@ -3089,7 +3086,7 @@
           <w:bCs/>
         </w:rPr>
         <w:pict w14:anchorId="7C24718A">
-          <v:rect id="_x0000_i1172" style="width:0;height:1.5pt" o:hralign="center" o:hrstd="t" o:hr="t" fillcolor="#a0a0a0" stroked="f"/>
+          <v:rect id="_x0000_i1026" style="width:0;height:1.5pt" o:hralign="center" o:hrstd="t" o:hr="t" fillcolor="#a0a0a0" stroked="f"/>
         </w:pict>
       </w:r>
     </w:p>
@@ -3372,7 +3369,7 @@
           <w:bCs/>
         </w:rPr>
         <w:pict w14:anchorId="1D24A54F">
-          <v:rect id="_x0000_i1173" style="width:0;height:1.5pt" o:hralign="center" o:hrstd="t" o:hr="t" fillcolor="#a0a0a0" stroked="f"/>
+          <v:rect id="_x0000_i1027" style="width:0;height:1.5pt" o:hralign="center" o:hrstd="t" o:hr="t" fillcolor="#a0a0a0" stroked="f"/>
         </w:pict>
       </w:r>
     </w:p>
@@ -3562,63 +3559,63 @@
           <w:b/>
           <w:bCs/>
         </w:rPr>
+        <w:pict w14:anchorId="21E68A03">
+          <v:rect id="_x0000_i1028" style="width:0;height:1.5pt" o:hralign="center" o:hrstd="t" o:hr="t" fillcolor="#a0a0a0" stroked="f"/>
+        </w:pict>
+      </w:r>
+    </w:p>
+    <w:p>
+      <w:pPr>
+        <w:rPr>
+          <w:b/>
+          <w:bCs/>
+        </w:rPr>
+      </w:pPr>
+      <w:r>
+        <w:rPr>
+          <w:b/>
+          <w:bCs/>
+        </w:rPr>
+        <w:t>3. Massacre at the Sacred Ground</w:t>
+      </w:r>
+    </w:p>
+    <w:p>
+      <w:pPr>
+        <w:rPr>
+          <w:b/>
+          <w:bCs/>
+        </w:rPr>
+      </w:pPr>
+      <w:r>
+        <w:rPr>
+          <w:b/>
+          <w:bCs/>
+        </w:rPr>
+        <w:t xml:space="preserve">Location: Sacred Ground of </w:t>
+      </w:r>
+      <w:proofErr w:type="spellStart"/>
+      <w:r>
+        <w:rPr>
+          <w:b/>
+          <w:bCs/>
+        </w:rPr>
+        <w:t>Ossory</w:t>
+      </w:r>
+      <w:proofErr w:type="spellEnd"/>
+    </w:p>
+    <w:p>
+      <w:pPr>
+        <w:rPr>
+          <w:b/>
+          <w:bCs/>
+        </w:rPr>
+      </w:pPr>
+      <w:r>
+        <w:rPr>
+          <w:b/>
+          <w:bCs/>
+        </w:rPr>
         <w:lastRenderedPageBreak/>
-        <w:pict w14:anchorId="21E68A03">
-          <v:rect id="_x0000_i1174" style="width:0;height:1.5pt" o:hralign="center" o:hrstd="t" o:hr="t" fillcolor="#a0a0a0" stroked="f"/>
-        </w:pict>
-      </w:r>
-    </w:p>
-    <w:p>
-      <w:pPr>
-        <w:rPr>
-          <w:b/>
-          <w:bCs/>
-        </w:rPr>
-      </w:pPr>
-      <w:r>
-        <w:rPr>
-          <w:b/>
-          <w:bCs/>
-        </w:rPr>
-        <w:t>3. Massacre at the Sacred Ground</w:t>
-      </w:r>
-    </w:p>
-    <w:p>
-      <w:pPr>
-        <w:rPr>
-          <w:b/>
-          <w:bCs/>
-        </w:rPr>
-      </w:pPr>
-      <w:r>
-        <w:rPr>
-          <w:b/>
-          <w:bCs/>
-        </w:rPr>
-        <w:t xml:space="preserve">Location: Sacred Ground of </w:t>
-      </w:r>
-      <w:proofErr w:type="spellStart"/>
-      <w:r>
-        <w:rPr>
-          <w:b/>
-          <w:bCs/>
-        </w:rPr>
-        <w:t>Ossory</w:t>
-      </w:r>
-      <w:proofErr w:type="spellEnd"/>
-    </w:p>
-    <w:p>
-      <w:pPr>
-        <w:rPr>
-          <w:b/>
-          <w:bCs/>
-        </w:rPr>
-      </w:pPr>
-      <w:r>
-        <w:rPr>
-          <w:b/>
-          <w:bCs/>
-        </w:rPr>
         <w:t>Encounter: Squad wipe</w:t>
       </w:r>
     </w:p>
@@ -3762,7 +3759,7 @@
           <w:bCs/>
         </w:rPr>
         <w:pict w14:anchorId="2449656A">
-          <v:rect id="_x0000_i1175" style="width:0;height:1.5pt" o:hralign="center" o:hrstd="t" o:hr="t" fillcolor="#a0a0a0" stroked="f"/>
+          <v:rect id="_x0000_i1029" style="width:0;height:1.5pt" o:hralign="center" o:hrstd="t" o:hr="t" fillcolor="#a0a0a0" stroked="f"/>
         </w:pict>
       </w:r>
     </w:p>
@@ -3989,7 +3986,7 @@
           <w:bCs/>
         </w:rPr>
         <w:pict w14:anchorId="2EC4628F">
-          <v:rect id="_x0000_i1176" style="width:0;height:1.5pt" o:hralign="center" o:hrstd="t" o:hr="t" fillcolor="#a0a0a0" stroked="f"/>
+          <v:rect id="_x0000_i1030" style="width:0;height:1.5pt" o:hralign="center" o:hrstd="t" o:hr="t" fillcolor="#a0a0a0" stroked="f"/>
         </w:pict>
       </w:r>
     </w:p>
@@ -4143,7 +4140,6 @@
           <w:b/>
           <w:bCs/>
         </w:rPr>
-        <w:lastRenderedPageBreak/>
         <w:t xml:space="preserve">First battle with </w:t>
       </w:r>
       <w:proofErr w:type="spellStart"/>
@@ -4222,6 +4218,7 @@
           <w:b/>
           <w:bCs/>
         </w:rPr>
+        <w:lastRenderedPageBreak/>
         <w:t>Encounter: First Dullahan appearance</w:t>
       </w:r>
     </w:p>
@@ -4360,7 +4357,7 @@
           <w:bCs/>
         </w:rPr>
         <w:pict w14:anchorId="3F05D3A1">
-          <v:rect id="_x0000_i1177" style="width:0;height:1.5pt" o:hralign="center" o:hrstd="t" o:hr="t" fillcolor="#a0a0a0" stroked="f"/>
+          <v:rect id="_x0000_i1031" style="width:0;height:1.5pt" o:hralign="center" o:hrstd="t" o:hr="t" fillcolor="#a0a0a0" stroked="f"/>
         </w:pict>
       </w:r>
     </w:p>
@@ -4408,7 +4405,7 @@
           <w:bCs/>
         </w:rPr>
         <w:pict w14:anchorId="5D948C7F">
-          <v:rect id="_x0000_i1178" style="width:0;height:1.5pt" o:hralign="center" o:hrstd="t" o:hr="t" fillcolor="#a0a0a0" stroked="f"/>
+          <v:rect id="_x0000_i1032" style="width:0;height:1.5pt" o:hralign="center" o:hrstd="t" o:hr="t" fillcolor="#a0a0a0" stroked="f"/>
         </w:pict>
       </w:r>
     </w:p>
@@ -4568,7 +4565,7 @@
           <w:bCs/>
         </w:rPr>
         <w:pict w14:anchorId="26DEC924">
-          <v:rect id="_x0000_i1179" style="width:0;height:1.5pt" o:hralign="center" o:hrstd="t" o:hr="t" fillcolor="#a0a0a0" stroked="f"/>
+          <v:rect id="_x0000_i1033" style="width:0;height:1.5pt" o:hralign="center" o:hrstd="t" o:hr="t" fillcolor="#a0a0a0" stroked="f"/>
         </w:pict>
       </w:r>
     </w:p>
@@ -4656,7 +4653,6 @@
           <w:b/>
           <w:bCs/>
         </w:rPr>
-        <w:lastRenderedPageBreak/>
         <w:t>Encounter: Investigation + combat</w:t>
       </w:r>
     </w:p>
@@ -4710,6 +4706,7 @@
           <w:b/>
           <w:bCs/>
         </w:rPr>
+        <w:lastRenderedPageBreak/>
         <w:t>First conversation</w:t>
       </w:r>
     </w:p>
@@ -4729,7 +4726,14 @@
           <w:b/>
           <w:bCs/>
         </w:rPr>
-        <w:t>Explains he observes endings, not causes</w:t>
+        <w:t xml:space="preserve">Explains </w:t>
+      </w:r>
+      <w:r>
+        <w:rPr>
+          <w:b/>
+          <w:bCs/>
+        </w:rPr>
+        <w:t>he is a harbinger of death and banshees are not</w:t>
       </w:r>
     </w:p>
     <w:p>
@@ -4782,14 +4786,14 @@
           <w:b/>
           <w:bCs/>
         </w:rPr>
-        <w:t>Corruption traced to a red grimoire</w:t>
-      </w:r>
-      <w:r>
-        <w:rPr>
-          <w:b/>
-          <w:bCs/>
-        </w:rPr>
-        <w:t xml:space="preserve"> held by Bishop </w:t>
+        <w:t xml:space="preserve">Corruption traced to </w:t>
+      </w:r>
+      <w:r>
+        <w:rPr>
+          <w:b/>
+          <w:bCs/>
+        </w:rPr>
+        <w:t xml:space="preserve">Bishop </w:t>
       </w:r>
       <w:r>
         <w:rPr>
@@ -4853,7 +4857,7 @@
           <w:bCs/>
         </w:rPr>
         <w:pict w14:anchorId="4BD73E39">
-          <v:rect id="_x0000_i1180" style="width:0;height:1.5pt" o:hralign="center" o:hrstd="t" o:hr="t" fillcolor="#a0a0a0" stroked="f"/>
+          <v:rect id="_x0000_i1034" style="width:0;height:1.5pt" o:hralign="center" o:hrstd="t" o:hr="t" fillcolor="#a0a0a0" stroked="f"/>
         </w:pict>
       </w:r>
     </w:p>
@@ -5049,7 +5053,7 @@
           <w:bCs/>
         </w:rPr>
         <w:pict w14:anchorId="1B7AE9E0">
-          <v:rect id="_x0000_i1181" style="width:0;height:1.5pt" o:hralign="center" o:hrstd="t" o:hr="t" fillcolor="#a0a0a0" stroked="f"/>
+          <v:rect id="_x0000_i1035" style="width:0;height:1.5pt" o:hralign="center" o:hrstd="t" o:hr="t" fillcolor="#a0a0a0" stroked="f"/>
         </w:pict>
       </w:r>
     </w:p>
@@ -5253,84 +5257,84 @@
           <w:b/>
           <w:bCs/>
         </w:rPr>
+        <w:t>Player switches sides</w:t>
+      </w:r>
+    </w:p>
+    <w:p>
+      <w:pPr>
+        <w:rPr>
+          <w:b/>
+          <w:bCs/>
+        </w:rPr>
+      </w:pPr>
+      <w:r>
+        <w:rPr>
+          <w:b/>
+          <w:bCs/>
+        </w:rPr>
+        <w:pict w14:anchorId="556AEFB2">
+          <v:rect id="_x0000_i1036" style="width:0;height:1.5pt" o:hralign="center" o:hrstd="t" o:hr="t" fillcolor="#a0a0a0" stroked="f"/>
+        </w:pict>
+      </w:r>
+    </w:p>
+    <w:p>
+      <w:pPr>
+        <w:rPr>
+          <w:b/>
+          <w:bCs/>
+        </w:rPr>
+      </w:pPr>
+      <w:r>
+        <w:rPr>
+          <w:b/>
+          <w:bCs/>
+        </w:rPr>
+        <w:t xml:space="preserve">10. Alber the </w:t>
+      </w:r>
+      <w:proofErr w:type="spellStart"/>
+      <w:r>
+        <w:rPr>
+          <w:b/>
+          <w:bCs/>
+        </w:rPr>
+        <w:t>Abhartach</w:t>
+      </w:r>
+      <w:proofErr w:type="spellEnd"/>
+      <w:r>
+        <w:rPr>
+          <w:b/>
+          <w:bCs/>
+        </w:rPr>
+        <w:t xml:space="preserve"> </w:t>
+      </w:r>
+      <w:r>
+        <w:rPr>
+          <w:b/>
+          <w:bCs/>
+        </w:rPr>
+        <w:t xml:space="preserve">Returns </w:t>
+      </w:r>
+      <w:r>
+        <w:rPr>
+          <w:b/>
+          <w:bCs/>
+        </w:rPr>
+        <w:t>– Second Fight</w:t>
+      </w:r>
+    </w:p>
+    <w:p>
+      <w:pPr>
+        <w:rPr>
+          <w:b/>
+          <w:bCs/>
+        </w:rPr>
+      </w:pPr>
+      <w:r>
+        <w:rPr>
+          <w:b/>
+          <w:bCs/>
+        </w:rPr>
         <w:lastRenderedPageBreak/>
-        <w:t>Player switches sides</w:t>
-      </w:r>
-    </w:p>
-    <w:p>
-      <w:pPr>
-        <w:rPr>
-          <w:b/>
-          <w:bCs/>
-        </w:rPr>
-      </w:pPr>
-      <w:r>
-        <w:rPr>
-          <w:b/>
-          <w:bCs/>
-        </w:rPr>
-        <w:pict w14:anchorId="556AEFB2">
-          <v:rect id="_x0000_i1182" style="width:0;height:1.5pt" o:hralign="center" o:hrstd="t" o:hr="t" fillcolor="#a0a0a0" stroked="f"/>
-        </w:pict>
-      </w:r>
-    </w:p>
-    <w:p>
-      <w:pPr>
-        <w:rPr>
-          <w:b/>
-          <w:bCs/>
-        </w:rPr>
-      </w:pPr>
-      <w:r>
-        <w:rPr>
-          <w:b/>
-          <w:bCs/>
-        </w:rPr>
-        <w:t xml:space="preserve">10. Alber the </w:t>
-      </w:r>
-      <w:proofErr w:type="spellStart"/>
-      <w:r>
-        <w:rPr>
-          <w:b/>
-          <w:bCs/>
-        </w:rPr>
-        <w:t>Abhartach</w:t>
-      </w:r>
-      <w:proofErr w:type="spellEnd"/>
-      <w:r>
-        <w:rPr>
-          <w:b/>
-          <w:bCs/>
-        </w:rPr>
-        <w:t xml:space="preserve"> </w:t>
-      </w:r>
-      <w:r>
-        <w:rPr>
-          <w:b/>
-          <w:bCs/>
-        </w:rPr>
-        <w:t xml:space="preserve">Returns </w:t>
-      </w:r>
-      <w:r>
-        <w:rPr>
-          <w:b/>
-          <w:bCs/>
-        </w:rPr>
-        <w:t>– Second Fight</w:t>
-      </w:r>
-    </w:p>
-    <w:p>
-      <w:pPr>
-        <w:rPr>
-          <w:b/>
-          <w:bCs/>
-        </w:rPr>
-      </w:pPr>
-      <w:r>
-        <w:rPr>
-          <w:b/>
-          <w:bCs/>
-        </w:rPr>
         <w:t>Location</w:t>
       </w:r>
       <w:r>
@@ -5516,7 +5520,7 @@
           <w:bCs/>
         </w:rPr>
         <w:pict w14:anchorId="027A57C9">
-          <v:rect id="_x0000_i1183" style="width:0;height:1.5pt" o:hralign="center" o:hrstd="t" o:hr="t" fillcolor="#a0a0a0" stroked="f"/>
+          <v:rect id="_x0000_i1037" style="width:0;height:1.5pt" o:hralign="center" o:hrstd="t" o:hr="t" fillcolor="#a0a0a0" stroked="f"/>
         </w:pict>
       </w:r>
     </w:p>
@@ -5703,7 +5707,7 @@
           <w:bCs/>
         </w:rPr>
         <w:pict w14:anchorId="2A865E83">
-          <v:rect id="_x0000_i1184" style="width:0;height:1.5pt" o:hralign="center" o:hrstd="t" o:hr="t" fillcolor="#a0a0a0" stroked="f"/>
+          <v:rect id="_x0000_i1038" style="width:0;height:1.5pt" o:hralign="center" o:hrstd="t" o:hr="t" fillcolor="#a0a0a0" stroked="f"/>
         </w:pict>
       </w:r>
     </w:p>
@@ -5825,7 +5829,6 @@
           <w:b/>
           <w:bCs/>
         </w:rPr>
-        <w:lastRenderedPageBreak/>
         <w:t>Encounter: Large</w:t>
       </w:r>
       <w:r>
@@ -5887,8 +5890,9 @@
           <w:b/>
           <w:bCs/>
         </w:rPr>
+        <w:lastRenderedPageBreak/>
         <w:pict w14:anchorId="7FE48CAC">
-          <v:rect id="_x0000_i1185" style="width:0;height:1.5pt" o:hralign="center" o:hrstd="t" o:hr="t" fillcolor="#a0a0a0" stroked="f"/>
+          <v:rect id="_x0000_i1039" style="width:0;height:1.5pt" o:hralign="center" o:hrstd="t" o:hr="t" fillcolor="#a0a0a0" stroked="f"/>
         </w:pict>
       </w:r>
     </w:p>
@@ -6033,7 +6037,7 @@
           <w:bCs/>
         </w:rPr>
         <w:pict w14:anchorId="7DF5A575">
-          <v:rect id="_x0000_i1186" style="width:0;height:1.5pt" o:hralign="center" o:hrstd="t" o:hr="t" fillcolor="#a0a0a0" stroked="f"/>
+          <v:rect id="_x0000_i1040" style="width:0;height:1.5pt" o:hralign="center" o:hrstd="t" o:hr="t" fillcolor="#a0a0a0" stroked="f"/>
         </w:pict>
       </w:r>
     </w:p>
@@ -6401,70 +6405,70 @@
           <w:b/>
           <w:bCs/>
         </w:rPr>
+        <w:pict w14:anchorId="53D966D3">
+          <v:rect id="_x0000_i1041" style="width:0;height:1.5pt" o:hralign="center" o:hrstd="t" o:hr="t" fillcolor="#a0a0a0" stroked="f"/>
+        </w:pict>
+      </w:r>
+    </w:p>
+    <w:p>
+      <w:pPr>
+        <w:rPr>
+          <w:b/>
+          <w:bCs/>
+        </w:rPr>
+      </w:pPr>
+      <w:r>
+        <w:rPr>
+          <w:b/>
+          <w:bCs/>
+        </w:rPr>
+        <w:t>15. Ogma – God Encounter</w:t>
+      </w:r>
+    </w:p>
+    <w:p>
+      <w:pPr>
+        <w:rPr>
+          <w:b/>
+          <w:bCs/>
+        </w:rPr>
+      </w:pPr>
+      <w:r>
+        <w:rPr>
+          <w:b/>
+          <w:bCs/>
+        </w:rPr>
+        <w:t xml:space="preserve">Location: New </w:t>
+      </w:r>
+      <w:proofErr w:type="spellStart"/>
+      <w:r>
+        <w:rPr>
+          <w:b/>
+          <w:bCs/>
+        </w:rPr>
+        <w:t>Ossory</w:t>
+      </w:r>
+      <w:proofErr w:type="spellEnd"/>
+      <w:r>
+        <w:rPr>
+          <w:b/>
+          <w:bCs/>
+        </w:rPr>
+        <w:t xml:space="preserve"> (Political Refugee Hub)</w:t>
+      </w:r>
+    </w:p>
+    <w:p>
+      <w:pPr>
+        <w:rPr>
+          <w:b/>
+          <w:bCs/>
+        </w:rPr>
+      </w:pPr>
+      <w:r>
+        <w:rPr>
+          <w:b/>
+          <w:bCs/>
+        </w:rPr>
         <w:lastRenderedPageBreak/>
-        <w:pict w14:anchorId="53D966D3">
-          <v:rect id="_x0000_i1187" style="width:0;height:1.5pt" o:hralign="center" o:hrstd="t" o:hr="t" fillcolor="#a0a0a0" stroked="f"/>
-        </w:pict>
-      </w:r>
-    </w:p>
-    <w:p>
-      <w:pPr>
-        <w:rPr>
-          <w:b/>
-          <w:bCs/>
-        </w:rPr>
-      </w:pPr>
-      <w:r>
-        <w:rPr>
-          <w:b/>
-          <w:bCs/>
-        </w:rPr>
-        <w:t>15. Ogma – God Encounter</w:t>
-      </w:r>
-    </w:p>
-    <w:p>
-      <w:pPr>
-        <w:rPr>
-          <w:b/>
-          <w:bCs/>
-        </w:rPr>
-      </w:pPr>
-      <w:r>
-        <w:rPr>
-          <w:b/>
-          <w:bCs/>
-        </w:rPr>
-        <w:t xml:space="preserve">Location: New </w:t>
-      </w:r>
-      <w:proofErr w:type="spellStart"/>
-      <w:r>
-        <w:rPr>
-          <w:b/>
-          <w:bCs/>
-        </w:rPr>
-        <w:t>Ossory</w:t>
-      </w:r>
-      <w:proofErr w:type="spellEnd"/>
-      <w:r>
-        <w:rPr>
-          <w:b/>
-          <w:bCs/>
-        </w:rPr>
-        <w:t xml:space="preserve"> (Political Refugee Hub)</w:t>
-      </w:r>
-    </w:p>
-    <w:p>
-      <w:pPr>
-        <w:rPr>
-          <w:b/>
-          <w:bCs/>
-        </w:rPr>
-      </w:pPr>
-      <w:r>
-        <w:rPr>
-          <w:b/>
-          <w:bCs/>
-        </w:rPr>
         <w:t>Encounter: Dialogue confrontation</w:t>
       </w:r>
     </w:p>
@@ -6565,7 +6569,7 @@
           <w:bCs/>
         </w:rPr>
         <w:pict w14:anchorId="564A8717">
-          <v:rect id="_x0000_i1188" style="width:0;height:1.5pt" o:hralign="center" o:hrstd="t" o:hr="t" fillcolor="#a0a0a0" stroked="f"/>
+          <v:rect id="_x0000_i1042" style="width:0;height:1.5pt" o:hralign="center" o:hrstd="t" o:hr="t" fillcolor="#a0a0a0" stroked="f"/>
         </w:pict>
       </w:r>
     </w:p>
@@ -7041,48 +7045,48 @@
           <w:b/>
           <w:bCs/>
         </w:rPr>
+        <w:t xml:space="preserve">Wolf-men followed her to </w:t>
+      </w:r>
+      <w:proofErr w:type="spellStart"/>
+      <w:r>
+        <w:rPr>
+          <w:b/>
+          <w:bCs/>
+        </w:rPr>
+        <w:t>Laghtaverty</w:t>
+      </w:r>
+      <w:proofErr w:type="spellEnd"/>
+      <w:r>
+        <w:rPr>
+          <w:b/>
+          <w:bCs/>
+        </w:rPr>
+        <w:t xml:space="preserve"> and convince her to help</w:t>
+      </w:r>
+    </w:p>
+    <w:p>
+      <w:pPr>
+        <w:rPr>
+          <w:b/>
+          <w:bCs/>
+        </w:rPr>
+      </w:pPr>
+      <w:r>
+        <w:rPr>
+          <w:b/>
+          <w:bCs/>
+        </w:rPr>
+        <w:pict w14:anchorId="042D606A">
+          <v:rect id="_x0000_i1043" style="width:0;height:1.5pt" o:hralign="center" o:hrstd="t" o:hr="t" fillcolor="#a0a0a0" stroked="f"/>
+        </w:pict>
+      </w:r>
+    </w:p>
+    <w:p>
+      <w:pPr>
+        <w:pStyle w:val="Heading4"/>
+      </w:pPr>
+      <w:r>
         <w:lastRenderedPageBreak/>
-        <w:t xml:space="preserve">Wolf-men followed her to </w:t>
-      </w:r>
-      <w:proofErr w:type="spellStart"/>
-      <w:r>
-        <w:rPr>
-          <w:b/>
-          <w:bCs/>
-        </w:rPr>
-        <w:t>Laghtaverty</w:t>
-      </w:r>
-      <w:proofErr w:type="spellEnd"/>
-      <w:r>
-        <w:rPr>
-          <w:b/>
-          <w:bCs/>
-        </w:rPr>
-        <w:t xml:space="preserve"> and convince her to help</w:t>
-      </w:r>
-    </w:p>
-    <w:p>
-      <w:pPr>
-        <w:rPr>
-          <w:b/>
-          <w:bCs/>
-        </w:rPr>
-      </w:pPr>
-      <w:r>
-        <w:rPr>
-          <w:b/>
-          <w:bCs/>
-        </w:rPr>
-        <w:pict w14:anchorId="042D606A">
-          <v:rect id="_x0000_i1189" style="width:0;height:1.5pt" o:hralign="center" o:hrstd="t" o:hr="t" fillcolor="#a0a0a0" stroked="f"/>
-        </w:pict>
-      </w:r>
-    </w:p>
-    <w:p>
-      <w:pPr>
-        <w:pStyle w:val="Heading4"/>
-      </w:pPr>
-      <w:r>
         <w:t>ACT III – INTEGRATION (I Am All of It)</w:t>
       </w:r>
     </w:p>
@@ -7122,7 +7126,7 @@
           <w:bCs/>
         </w:rPr>
         <w:pict w14:anchorId="1AF0CDB0">
-          <v:rect id="_x0000_i1191" style="width:0;height:1.5pt" o:hralign="center" o:hrstd="t" o:hr="t" fillcolor="#a0a0a0" stroked="f"/>
+          <v:rect id="_x0000_i1044" style="width:0;height:1.5pt" o:hralign="center" o:hrstd="t" o:hr="t" fillcolor="#a0a0a0" stroked="f"/>
         </w:pict>
       </w:r>
     </w:p>
@@ -7291,7 +7295,7 @@
           <w:bCs/>
         </w:rPr>
         <w:pict w14:anchorId="230F8885">
-          <v:rect id="_x0000_i1192" style="width:0;height:1.5pt" o:hralign="center" o:hrstd="t" o:hr="t" fillcolor="#a0a0a0" stroked="f"/>
+          <v:rect id="_x0000_i1045" style="width:0;height:1.5pt" o:hralign="center" o:hrstd="t" o:hr="t" fillcolor="#a0a0a0" stroked="f"/>
         </w:pict>
       </w:r>
     </w:p>
@@ -7465,7 +7469,7 @@
           <w:bCs/>
         </w:rPr>
         <w:pict w14:anchorId="25F516E8">
-          <v:rect id="_x0000_i1193" style="width:0;height:1.5pt" o:hralign="center" o:hrstd="t" o:hr="t" fillcolor="#a0a0a0" stroked="f"/>
+          <v:rect id="_x0000_i1046" style="width:0;height:1.5pt" o:hralign="center" o:hrstd="t" o:hr="t" fillcolor="#a0a0a0" stroked="f"/>
         </w:pict>
       </w:r>
     </w:p>
@@ -7647,53 +7651,53 @@
           <w:b/>
           <w:bCs/>
         </w:rPr>
+        <w:pict w14:anchorId="467C8BC9">
+          <v:rect id="_x0000_i1047" style="width:0;height:1.5pt" o:hralign="center" o:hrstd="t" o:hr="t" fillcolor="#a0a0a0" stroked="f"/>
+        </w:pict>
+      </w:r>
+    </w:p>
+    <w:p>
+      <w:pPr>
+        <w:rPr>
+          <w:b/>
+          <w:bCs/>
+        </w:rPr>
+      </w:pPr>
+      <w:r>
+        <w:rPr>
+          <w:b/>
+          <w:bCs/>
+        </w:rPr>
+        <w:t>2</w:t>
+      </w:r>
+      <w:r>
+        <w:rPr>
+          <w:b/>
+          <w:bCs/>
+        </w:rPr>
+        <w:t>0</w:t>
+      </w:r>
+      <w:r>
+        <w:rPr>
+          <w:b/>
+          <w:bCs/>
+        </w:rPr>
+        <w:t>. Balor of the Evil Eye</w:t>
+      </w:r>
+    </w:p>
+    <w:p>
+      <w:pPr>
+        <w:rPr>
+          <w:b/>
+          <w:bCs/>
+        </w:rPr>
+      </w:pPr>
+      <w:r>
+        <w:rPr>
+          <w:b/>
+          <w:bCs/>
+        </w:rPr>
         <w:lastRenderedPageBreak/>
-        <w:pict w14:anchorId="467C8BC9">
-          <v:rect id="_x0000_i1194" style="width:0;height:1.5pt" o:hralign="center" o:hrstd="t" o:hr="t" fillcolor="#a0a0a0" stroked="f"/>
-        </w:pict>
-      </w:r>
-    </w:p>
-    <w:p>
-      <w:pPr>
-        <w:rPr>
-          <w:b/>
-          <w:bCs/>
-        </w:rPr>
-      </w:pPr>
-      <w:r>
-        <w:rPr>
-          <w:b/>
-          <w:bCs/>
-        </w:rPr>
-        <w:t>2</w:t>
-      </w:r>
-      <w:r>
-        <w:rPr>
-          <w:b/>
-          <w:bCs/>
-        </w:rPr>
-        <w:t>0</w:t>
-      </w:r>
-      <w:r>
-        <w:rPr>
-          <w:b/>
-          <w:bCs/>
-        </w:rPr>
-        <w:t>. Balor of the Evil Eye</w:t>
-      </w:r>
-    </w:p>
-    <w:p>
-      <w:pPr>
-        <w:rPr>
-          <w:b/>
-          <w:bCs/>
-        </w:rPr>
-      </w:pPr>
-      <w:r>
-        <w:rPr>
-          <w:b/>
-          <w:bCs/>
-        </w:rPr>
         <w:t>Location</w:t>
       </w:r>
       <w:r>
@@ -8004,7 +8008,7 @@
           <w:bCs/>
         </w:rPr>
         <w:pict w14:anchorId="330B7F21">
-          <v:rect id="_x0000_i1195" style="width:0;height:1.5pt" o:hralign="center" o:hrstd="t" o:hr="t" fillcolor="#a0a0a0" stroked="f"/>
+          <v:rect id="_x0000_i1048" style="width:0;height:1.5pt" o:hralign="center" o:hrstd="t" o:hr="t" fillcolor="#a0a0a0" stroked="f"/>
         </w:pict>
       </w:r>
     </w:p>
@@ -8158,7 +8162,7 @@
           <w:bCs/>
         </w:rPr>
         <w:pict w14:anchorId="5B18D80C">
-          <v:rect id="_x0000_i1196" style="width:0;height:1.5pt" o:hralign="center" o:hrstd="t" o:hr="t" fillcolor="#a0a0a0" stroked="f"/>
+          <v:rect id="_x0000_i1049" style="width:0;height:1.5pt" o:hralign="center" o:hrstd="t" o:hr="t" fillcolor="#a0a0a0" stroked="f"/>
         </w:pict>
       </w:r>
     </w:p>
@@ -8343,7 +8347,7 @@
           <w:bCs/>
         </w:rPr>
         <w:pict w14:anchorId="63253400">
-          <v:rect id="_x0000_i1197" style="width:0;height:1.5pt" o:hralign="center" o:hrstd="t" o:hr="t" fillcolor="#a0a0a0" stroked="f"/>
+          <v:rect id="_x0000_i1050" style="width:0;height:1.5pt" o:hralign="center" o:hrstd="t" o:hr="t" fillcolor="#a0a0a0" stroked="f"/>
         </w:pict>
       </w:r>
     </w:p>
@@ -8359,51 +8363,51 @@
           <w:b/>
           <w:bCs/>
         </w:rPr>
+        <w:t>2</w:t>
+      </w:r>
+      <w:r>
+        <w:rPr>
+          <w:b/>
+          <w:bCs/>
+        </w:rPr>
+        <w:t>3</w:t>
+      </w:r>
+      <w:r>
+        <w:rPr>
+          <w:b/>
+          <w:bCs/>
+        </w:rPr>
+        <w:t>. Dagda – God Encounter</w:t>
+      </w:r>
+    </w:p>
+    <w:p>
+      <w:pPr>
+        <w:rPr>
+          <w:b/>
+          <w:bCs/>
+        </w:rPr>
+      </w:pPr>
+      <w:r>
+        <w:rPr>
+          <w:b/>
+          <w:bCs/>
+        </w:rPr>
+        <w:t>Location: Threshold Before Final Battle</w:t>
+      </w:r>
+    </w:p>
+    <w:p>
+      <w:pPr>
+        <w:rPr>
+          <w:b/>
+          <w:bCs/>
+        </w:rPr>
+      </w:pPr>
+      <w:r>
+        <w:rPr>
+          <w:b/>
+          <w:bCs/>
+        </w:rPr>
         <w:lastRenderedPageBreak/>
-        <w:t>2</w:t>
-      </w:r>
-      <w:r>
-        <w:rPr>
-          <w:b/>
-          <w:bCs/>
-        </w:rPr>
-        <w:t>3</w:t>
-      </w:r>
-      <w:r>
-        <w:rPr>
-          <w:b/>
-          <w:bCs/>
-        </w:rPr>
-        <w:t>. Dagda – God Encounter</w:t>
-      </w:r>
-    </w:p>
-    <w:p>
-      <w:pPr>
-        <w:rPr>
-          <w:b/>
-          <w:bCs/>
-        </w:rPr>
-      </w:pPr>
-      <w:r>
-        <w:rPr>
-          <w:b/>
-          <w:bCs/>
-        </w:rPr>
-        <w:t>Location: Threshold Before Final Battle</w:t>
-      </w:r>
-    </w:p>
-    <w:p>
-      <w:pPr>
-        <w:rPr>
-          <w:b/>
-          <w:bCs/>
-        </w:rPr>
-      </w:pPr>
-      <w:r>
-        <w:rPr>
-          <w:b/>
-          <w:bCs/>
-        </w:rPr>
         <w:t>Encounter: Strange hospitality</w:t>
       </w:r>
     </w:p>
@@ -8473,7 +8477,7 @@
           <w:bCs/>
         </w:rPr>
         <w:pict w14:anchorId="2548D691">
-          <v:rect id="_x0000_i1198" style="width:0;height:1.5pt" o:hralign="center" o:hrstd="t" o:hr="t" fillcolor="#a0a0a0" stroked="f"/>
+          <v:rect id="_x0000_i1051" style="width:0;height:1.5pt" o:hralign="center" o:hrstd="t" o:hr="t" fillcolor="#a0a0a0" stroked="f"/>
         </w:pict>
       </w:r>
     </w:p>
@@ -8715,7 +8719,7 @@
           <w:bCs/>
         </w:rPr>
         <w:pict w14:anchorId="765C4819">
-          <v:rect id="_x0000_i1199" style="width:0;height:1.5pt" o:hralign="center" o:hrstd="t" o:hr="t" fillcolor="#a0a0a0" stroked="f"/>
+          <v:rect id="_x0000_i1052" style="width:0;height:1.5pt" o:hralign="center" o:hrstd="t" o:hr="t" fillcolor="#a0a0a0" stroked="f"/>
         </w:pict>
       </w:r>
     </w:p>
@@ -8921,7 +8925,6 @@
           <w:b/>
           <w:bCs/>
         </w:rPr>
-        <w:lastRenderedPageBreak/>
         <w:t>Morrigan silent</w:t>
       </w:r>
     </w:p>
@@ -9268,7 +9271,7 @@
     <w:p>
       <w:r>
         <w:pict w14:anchorId="68AC96C1">
-          <v:rect id="_x0000_i1224" style="width:0;height:1.5pt" o:hralign="center" o:hrstd="t" o:hr="t" fillcolor="#a0a0a0" stroked="f"/>
+          <v:rect id="_x0000_i1053" style="width:0;height:1.5pt" o:hralign="center" o:hrstd="t" o:hr="t" fillcolor="#a0a0a0" stroked="f"/>
         </w:pict>
       </w:r>
     </w:p>
@@ -9293,7 +9296,6 @@
           <w:b/>
           <w:bCs/>
         </w:rPr>
-        <w:lastRenderedPageBreak/>
         <w:t>God of:</w:t>
       </w:r>
       <w:r>
@@ -9332,6 +9334,7 @@
           <w:b/>
           <w:bCs/>
         </w:rPr>
+        <w:lastRenderedPageBreak/>
         <w:t>Placement</w:t>
       </w:r>
     </w:p>
@@ -9535,7 +9538,7 @@
     <w:p>
       <w:r>
         <w:pict w14:anchorId="40206179">
-          <v:rect id="_x0000_i1225" style="width:0;height:1.5pt" o:hralign="center" o:hrstd="t" o:hr="t" fillcolor="#a0a0a0" stroked="f"/>
+          <v:rect id="_x0000_i1054" style="width:0;height:1.5pt" o:hralign="center" o:hrstd="t" o:hr="t" fillcolor="#a0a0a0" stroked="f"/>
         </w:pict>
       </w:r>
     </w:p>
@@ -9669,7 +9672,6 @@
         </w:numPr>
       </w:pPr>
       <w:r>
-        <w:lastRenderedPageBreak/>
         <w:t>Paths loop, horizons lie</w:t>
       </w:r>
     </w:p>
@@ -9692,6 +9694,7 @@
         </w:numPr>
       </w:pPr>
       <w:r>
+        <w:lastRenderedPageBreak/>
         <w:t>He does not lie—he reframes truth</w:t>
       </w:r>
     </w:p>
@@ -9813,7 +9816,7 @@
     <w:p>
       <w:r>
         <w:pict w14:anchorId="3548465C">
-          <v:rect id="_x0000_i1226" style="width:0;height:1.5pt" o:hralign="center" o:hrstd="t" o:hr="t" fillcolor="#a0a0a0" stroked="f"/>
+          <v:rect id="_x0000_i1055" style="width:0;height:1.5pt" o:hralign="center" o:hrstd="t" o:hr="t" fillcolor="#a0a0a0" stroked="f"/>
         </w:pict>
       </w:r>
     </w:p>
@@ -10019,27 +10022,27 @@
     </w:p>
     <w:p>
       <w:r>
+        <w:t>Ogma offers her a name of power.</w:t>
+      </w:r>
+    </w:p>
+    <w:p>
+      <w:r>
+        <w:t>She refuses.</w:t>
+      </w:r>
+    </w:p>
+    <w:p>
+      <w:pPr>
+        <w:rPr>
+          <w:b/>
+          <w:bCs/>
+        </w:rPr>
+      </w:pPr>
+      <w:r>
+        <w:rPr>
+          <w:b/>
+          <w:bCs/>
+        </w:rPr>
         <w:lastRenderedPageBreak/>
-        <w:t>Ogma offers her a name of power.</w:t>
-      </w:r>
-    </w:p>
-    <w:p>
-      <w:r>
-        <w:t>She refuses.</w:t>
-      </w:r>
-    </w:p>
-    <w:p>
-      <w:pPr>
-        <w:rPr>
-          <w:b/>
-          <w:bCs/>
-        </w:rPr>
-      </w:pPr>
-      <w:r>
-        <w:rPr>
-          <w:b/>
-          <w:bCs/>
-        </w:rPr>
         <w:t>Power Granted (Unwanted)</w:t>
       </w:r>
     </w:p>
@@ -10099,7 +10102,7 @@
     <w:p>
       <w:r>
         <w:pict w14:anchorId="30C00460">
-          <v:rect id="_x0000_i1227" style="width:0;height:1.5pt" o:hralign="center" o:hrstd="t" o:hr="t" fillcolor="#a0a0a0" stroked="f"/>
+          <v:rect id="_x0000_i1056" style="width:0;height:1.5pt" o:hralign="center" o:hrstd="t" o:hr="t" fillcolor="#a0a0a0" stroked="f"/>
         </w:pict>
       </w:r>
     </w:p>
@@ -21525,6 +21528,7 @@
   <w:style w:type="character" w:default="1" w:styleId="DefaultParagraphFont">
     <w:name w:val="Default Paragraph Font"/>
     <w:uiPriority w:val="1"/>
+    <w:semiHidden/>
     <w:unhideWhenUsed/>
   </w:style>
   <w:style w:type="table" w:default="1" w:styleId="TableNormal">

</xml_diff>